<commit_message>
Complete Sprint 2 gameplay and tests
</commit_message>
<xml_diff>
--- a/Docs/CS449Sprint1.docx
+++ b/Docs/CS449Sprint1.docx
@@ -594,12 +594,12 @@
                 <wp:inline distB="0" distT="0" distL="0" distR="0">
                   <wp:extent cx="2035119" cy="2145324"/>
                   <wp:effectExtent b="0" l="0" r="0" t="0"/>
-                  <wp:docPr descr="Simple UI of the Solitaire game" id="3" name="image1.png"/>
+                  <wp:docPr descr="Simple UI of the Solitaire game" id="3" name="image2.png"/>
                   <a:graphic>
                     <a:graphicData uri="http://schemas.openxmlformats.org/drawingml/2006/picture">
                       <pic:pic>
                         <pic:nvPicPr>
-                          <pic:cNvPr descr="Simple UI of the Solitaire game" id="0" name="image1.png"/>
+                          <pic:cNvPr descr="Simple UI of the Solitaire game" id="0" name="image2.png"/>
                           <pic:cNvPicPr preferRelativeResize="0"/>
                         </pic:nvPicPr>
                         <pic:blipFill>
@@ -1696,12 +1696,12 @@
                 <wp:inline distB="114300" distT="114300" distL="114300" distR="114300">
                   <wp:extent cx="3176588" cy="1290489"/>
                   <wp:effectExtent b="0" l="0" r="0" t="0"/>
-                  <wp:docPr id="4" name="image4.png"/>
+                  <wp:docPr id="4" name="image1.png"/>
                   <a:graphic>
                     <a:graphicData uri="http://schemas.openxmlformats.org/drawingml/2006/picture">
                       <pic:pic>
                         <pic:nvPicPr>
-                          <pic:cNvPr id="0" name="image4.png"/>
+                          <pic:cNvPr id="0" name="image1.png"/>
                           <pic:cNvPicPr preferRelativeResize="0"/>
                         </pic:nvPicPr>
                         <pic:blipFill>
@@ -1852,12 +1852,12 @@
                 <wp:inline distB="114300" distT="114300" distL="114300" distR="114300">
                   <wp:extent cx="3287586" cy="1018031"/>
                   <wp:effectExtent b="0" l="0" r="0" t="0"/>
-                  <wp:docPr id="5" name="image2.png"/>
+                  <wp:docPr id="5" name="image4.png"/>
                   <a:graphic>
                     <a:graphicData uri="http://schemas.openxmlformats.org/drawingml/2006/picture">
                       <pic:pic>
                         <pic:nvPicPr>
-                          <pic:cNvPr id="0" name="image2.png"/>
+                          <pic:cNvPr id="0" name="image4.png"/>
                           <pic:cNvPicPr preferRelativeResize="0"/>
                         </pic:nvPicPr>
                         <pic:blipFill>
@@ -2789,6 +2789,7 @@
       <w:tr>
         <w:trPr>
           <w:cantSplit w:val="0"/>
+          <w:trHeight w:val="121.4794921875" w:hRule="atLeast"/>
           <w:tblHeader w:val="0"/>
         </w:trPr>
         <w:tc>
@@ -2903,58 +2904,472 @@
                 <w:szCs w:val="21"/>
                 <w:rtl w:val="0"/>
               </w:rPr>
-              <w:t xml:space="preserve">…</w:t>
-            </w:r>
-          </w:p>
-        </w:tc>
-        <w:tc>
-          <w:tcPr/>
-          <w:p>
-            <w:pPr>
-              <w:rPr>
-                <w:rFonts w:ascii="Times New Roman" w:cs="Times New Roman" w:eastAsia="Times New Roman" w:hAnsi="Times New Roman"/>
-                <w:sz w:val="21"/>
-                <w:szCs w:val="21"/>
-              </w:rPr>
-            </w:pPr>
-            <w:r>
-              <w:rPr>
-                <w:rtl w:val="0"/>
-              </w:rPr>
-            </w:r>
-          </w:p>
-        </w:tc>
-        <w:tc>
-          <w:tcPr/>
-          <w:p>
-            <w:pPr>
-              <w:rPr>
-                <w:rFonts w:ascii="Times New Roman" w:cs="Times New Roman" w:eastAsia="Times New Roman" w:hAnsi="Times New Roman"/>
-                <w:sz w:val="21"/>
-                <w:szCs w:val="21"/>
-              </w:rPr>
-            </w:pPr>
-            <w:r>
-              <w:rPr>
-                <w:rtl w:val="0"/>
-              </w:rPr>
-            </w:r>
-          </w:p>
-        </w:tc>
-        <w:tc>
-          <w:tcPr/>
-          <w:p>
-            <w:pPr>
-              <w:rPr>
-                <w:rFonts w:ascii="Times New Roman" w:cs="Times New Roman" w:eastAsia="Times New Roman" w:hAnsi="Times New Roman"/>
-                <w:sz w:val="21"/>
-                <w:szCs w:val="21"/>
-              </w:rPr>
-            </w:pPr>
-            <w:r>
-              <w:rPr>
-                <w:rtl w:val="0"/>
-              </w:rPr>
+              <w:t xml:space="preserve">3. Start a new game of the chosen board size and type</w:t>
+            </w:r>
+          </w:p>
+        </w:tc>
+        <w:tc>
+          <w:tcPr/>
+          <w:p>
+            <w:pPr>
+              <w:rPr>
+                <w:rFonts w:ascii="Times New Roman" w:cs="Times New Roman" w:eastAsia="Times New Roman" w:hAnsi="Times New Roman"/>
+                <w:sz w:val="21"/>
+                <w:szCs w:val="21"/>
+              </w:rPr>
+            </w:pPr>
+            <w:r>
+              <w:rPr>
+                <w:rFonts w:ascii="Times New Roman" w:cs="Times New Roman" w:eastAsia="Times New Roman" w:hAnsi="Times New Roman"/>
+                <w:sz w:val="21"/>
+                <w:szCs w:val="21"/>
+                <w:rtl w:val="0"/>
+              </w:rPr>
+              <w:t xml:space="preserve">3.1</w:t>
+            </w:r>
+          </w:p>
+        </w:tc>
+        <w:tc>
+          <w:tcPr/>
+          <w:p>
+            <w:pPr>
+              <w:rPr>
+                <w:rFonts w:ascii="Times New Roman" w:cs="Times New Roman" w:eastAsia="Times New Roman" w:hAnsi="Times New Roman"/>
+                <w:sz w:val="21"/>
+                <w:szCs w:val="21"/>
+              </w:rPr>
+            </w:pPr>
+            <w:r>
+              <w:rPr>
+                <w:rFonts w:ascii="Times New Roman" w:cs="Times New Roman" w:eastAsia="Times New Roman" w:hAnsi="Times New Roman"/>
+                <w:sz w:val="21"/>
+                <w:szCs w:val="21"/>
+                <w:rtl w:val="0"/>
+              </w:rPr>
+              <w:t xml:space="preserve">Given I have selected a supported board size and type</w:t>
+            </w:r>
+          </w:p>
+          <w:p>
+            <w:pPr>
+              <w:rPr>
+                <w:rFonts w:ascii="Times New Roman" w:cs="Times New Roman" w:eastAsia="Times New Roman" w:hAnsi="Times New Roman"/>
+                <w:sz w:val="21"/>
+                <w:szCs w:val="21"/>
+              </w:rPr>
+            </w:pPr>
+            <w:r>
+              <w:rPr>
+                <w:rFonts w:ascii="Times New Roman" w:cs="Times New Roman" w:eastAsia="Times New Roman" w:hAnsi="Times New Roman"/>
+                <w:sz w:val="21"/>
+                <w:szCs w:val="21"/>
+                <w:rtl w:val="0"/>
+              </w:rPr>
+              <w:t xml:space="preserve">When I click New Game</w:t>
+            </w:r>
+          </w:p>
+          <w:p>
+            <w:pPr>
+              <w:rPr>
+                <w:rFonts w:ascii="Times New Roman" w:cs="Times New Roman" w:eastAsia="Times New Roman" w:hAnsi="Times New Roman"/>
+                <w:sz w:val="21"/>
+                <w:szCs w:val="21"/>
+              </w:rPr>
+            </w:pPr>
+            <w:r>
+              <w:rPr>
+                <w:rFonts w:ascii="Times New Roman" w:cs="Times New Roman" w:eastAsia="Times New Roman" w:hAnsi="Times New Roman"/>
+                <w:sz w:val="21"/>
+                <w:szCs w:val="21"/>
+                <w:rtl w:val="0"/>
+              </w:rPr>
+              <w:t xml:space="preserve">Then the selected board appears with the center hole empty and all other playable holes occupied.</w:t>
+            </w:r>
+          </w:p>
+        </w:tc>
+        <w:tc>
+          <w:tcPr/>
+          <w:p>
+            <w:pPr>
+              <w:rPr>
+                <w:rFonts w:ascii="Times New Roman" w:cs="Times New Roman" w:eastAsia="Times New Roman" w:hAnsi="Times New Roman"/>
+                <w:sz w:val="21"/>
+                <w:szCs w:val="21"/>
+              </w:rPr>
+            </w:pPr>
+            <w:r>
+              <w:rPr>
+                <w:rFonts w:ascii="Times New Roman" w:cs="Times New Roman" w:eastAsia="Times New Roman" w:hAnsi="Times New Roman"/>
+                <w:sz w:val="21"/>
+                <w:szCs w:val="21"/>
+                <w:rtl w:val="0"/>
+              </w:rPr>
+              <w:t xml:space="preserve">ToDo</w:t>
+            </w:r>
+          </w:p>
+        </w:tc>
+      </w:tr>
+      <w:tr>
+        <w:trPr>
+          <w:cantSplit w:val="0"/>
+          <w:tblHeader w:val="0"/>
+        </w:trPr>
+        <w:tc>
+          <w:tcPr/>
+          <w:p>
+            <w:pPr>
+              <w:rPr>
+                <w:rFonts w:ascii="Times New Roman" w:cs="Times New Roman" w:eastAsia="Times New Roman" w:hAnsi="Times New Roman"/>
+                <w:sz w:val="21"/>
+                <w:szCs w:val="21"/>
+              </w:rPr>
+            </w:pPr>
+            <w:r>
+              <w:rPr>
+                <w:rFonts w:ascii="Times New Roman" w:cs="Times New Roman" w:eastAsia="Times New Roman" w:hAnsi="Times New Roman"/>
+                <w:sz w:val="21"/>
+                <w:szCs w:val="21"/>
+                <w:rtl w:val="0"/>
+              </w:rPr>
+              <w:t xml:space="preserve">4. Make a move in a game</w:t>
+            </w:r>
+          </w:p>
+        </w:tc>
+        <w:tc>
+          <w:tcPr/>
+          <w:p>
+            <w:pPr>
+              <w:rPr>
+                <w:rFonts w:ascii="Times New Roman" w:cs="Times New Roman" w:eastAsia="Times New Roman" w:hAnsi="Times New Roman"/>
+                <w:sz w:val="21"/>
+                <w:szCs w:val="21"/>
+              </w:rPr>
+            </w:pPr>
+            <w:r>
+              <w:rPr>
+                <w:rtl w:val="0"/>
+              </w:rPr>
+            </w:r>
+          </w:p>
+        </w:tc>
+        <w:tc>
+          <w:tcPr/>
+          <w:p>
+            <w:pPr>
+              <w:rPr>
+                <w:rFonts w:ascii="Times New Roman" w:cs="Times New Roman" w:eastAsia="Times New Roman" w:hAnsi="Times New Roman"/>
+                <w:sz w:val="21"/>
+                <w:szCs w:val="21"/>
+              </w:rPr>
+            </w:pPr>
+            <w:r>
+              <w:rPr>
+                <w:rFonts w:ascii="Times New Roman" w:cs="Times New Roman" w:eastAsia="Times New Roman" w:hAnsi="Times New Roman"/>
+                <w:sz w:val="21"/>
+                <w:szCs w:val="21"/>
+                <w:rtl w:val="0"/>
+              </w:rPr>
+              <w:t xml:space="preserve">Given a peg can jump over an adjacent peg into an empty playable hole two positions away in an allowed direction</w:t>
+            </w:r>
+          </w:p>
+          <w:p>
+            <w:pPr>
+              <w:rPr>
+                <w:rFonts w:ascii="Times New Roman" w:cs="Times New Roman" w:eastAsia="Times New Roman" w:hAnsi="Times New Roman"/>
+                <w:sz w:val="21"/>
+                <w:szCs w:val="21"/>
+              </w:rPr>
+            </w:pPr>
+            <w:r>
+              <w:rPr>
+                <w:rFonts w:ascii="Times New Roman" w:cs="Times New Roman" w:eastAsia="Times New Roman" w:hAnsi="Times New Roman"/>
+                <w:sz w:val="21"/>
+                <w:szCs w:val="21"/>
+                <w:rtl w:val="0"/>
+              </w:rPr>
+              <w:t xml:space="preserve">When I select the starting peg and its destination</w:t>
+            </w:r>
+          </w:p>
+          <w:p>
+            <w:pPr>
+              <w:rPr>
+                <w:rFonts w:ascii="Times New Roman" w:cs="Times New Roman" w:eastAsia="Times New Roman" w:hAnsi="Times New Roman"/>
+                <w:sz w:val="21"/>
+                <w:szCs w:val="21"/>
+              </w:rPr>
+            </w:pPr>
+            <w:r>
+              <w:rPr>
+                <w:rFonts w:ascii="Times New Roman" w:cs="Times New Roman" w:eastAsia="Times New Roman" w:hAnsi="Times New Roman"/>
+                <w:sz w:val="21"/>
+                <w:szCs w:val="21"/>
+                <w:rtl w:val="0"/>
+              </w:rPr>
+              <w:t xml:space="preserve">Then the peg moves to the destination, the jumped peg is removed, and the peg count decreases by one.</w:t>
+            </w:r>
+          </w:p>
+        </w:tc>
+        <w:tc>
+          <w:tcPr/>
+          <w:p>
+            <w:pPr>
+              <w:rPr>
+                <w:rFonts w:ascii="Times New Roman" w:cs="Times New Roman" w:eastAsia="Times New Roman" w:hAnsi="Times New Roman"/>
+                <w:sz w:val="21"/>
+                <w:szCs w:val="21"/>
+              </w:rPr>
+            </w:pPr>
+            <w:r>
+              <w:rPr>
+                <w:rFonts w:ascii="Times New Roman" w:cs="Times New Roman" w:eastAsia="Times New Roman" w:hAnsi="Times New Roman"/>
+                <w:sz w:val="21"/>
+                <w:szCs w:val="21"/>
+                <w:rtl w:val="0"/>
+              </w:rPr>
+              <w:t xml:space="preserve">ToDo</w:t>
+            </w:r>
+          </w:p>
+        </w:tc>
+      </w:tr>
+      <w:tr>
+        <w:trPr>
+          <w:cantSplit w:val="0"/>
+          <w:tblHeader w:val="0"/>
+        </w:trPr>
+        <w:tc>
+          <w:tcPr/>
+          <w:p>
+            <w:pPr>
+              <w:rPr>
+                <w:rFonts w:ascii="Times New Roman" w:cs="Times New Roman" w:eastAsia="Times New Roman" w:hAnsi="Times New Roman"/>
+                <w:sz w:val="21"/>
+                <w:szCs w:val="21"/>
+              </w:rPr>
+            </w:pPr>
+            <w:r>
+              <w:rPr>
+                <w:rFonts w:ascii="Times New Roman" w:cs="Times New Roman" w:eastAsia="Times New Roman" w:hAnsi="Times New Roman"/>
+                <w:sz w:val="21"/>
+                <w:szCs w:val="21"/>
+                <w:rtl w:val="0"/>
+              </w:rPr>
+              <w:t xml:space="preserve">4. Make a move in a game</w:t>
+            </w:r>
+          </w:p>
+        </w:tc>
+        <w:tc>
+          <w:tcPr/>
+          <w:p>
+            <w:pPr>
+              <w:rPr>
+                <w:rFonts w:ascii="Times New Roman" w:cs="Times New Roman" w:eastAsia="Times New Roman" w:hAnsi="Times New Roman"/>
+                <w:sz w:val="21"/>
+                <w:szCs w:val="21"/>
+              </w:rPr>
+            </w:pPr>
+            <w:r>
+              <w:rPr>
+                <w:rtl w:val="0"/>
+              </w:rPr>
+            </w:r>
+          </w:p>
+        </w:tc>
+        <w:tc>
+          <w:tcPr/>
+          <w:p>
+            <w:pPr>
+              <w:rPr>
+                <w:rFonts w:ascii="Times New Roman" w:cs="Times New Roman" w:eastAsia="Times New Roman" w:hAnsi="Times New Roman"/>
+                <w:sz w:val="21"/>
+                <w:szCs w:val="21"/>
+              </w:rPr>
+            </w:pPr>
+            <w:r>
+              <w:rPr>
+                <w:rFonts w:ascii="Times New Roman" w:cs="Times New Roman" w:eastAsia="Times New Roman" w:hAnsi="Times New Roman"/>
+                <w:sz w:val="21"/>
+                <w:szCs w:val="21"/>
+                <w:rtl w:val="0"/>
+              </w:rPr>
+              <w:t xml:space="preserve">Given a proposed move does not follow the game rules</w:t>
+            </w:r>
+          </w:p>
+          <w:p>
+            <w:pPr>
+              <w:rPr>
+                <w:rFonts w:ascii="Times New Roman" w:cs="Times New Roman" w:eastAsia="Times New Roman" w:hAnsi="Times New Roman"/>
+                <w:sz w:val="21"/>
+                <w:szCs w:val="21"/>
+              </w:rPr>
+            </w:pPr>
+            <w:r>
+              <w:rPr>
+                <w:rFonts w:ascii="Times New Roman" w:cs="Times New Roman" w:eastAsia="Times New Roman" w:hAnsi="Times New Roman"/>
+                <w:sz w:val="21"/>
+                <w:szCs w:val="21"/>
+                <w:rtl w:val="0"/>
+              </w:rPr>
+              <w:t xml:space="preserve">When I attempt that move</w:t>
+            </w:r>
+          </w:p>
+          <w:p>
+            <w:pPr>
+              <w:rPr>
+                <w:rFonts w:ascii="Times New Roman" w:cs="Times New Roman" w:eastAsia="Times New Roman" w:hAnsi="Times New Roman"/>
+                <w:sz w:val="21"/>
+                <w:szCs w:val="21"/>
+              </w:rPr>
+            </w:pPr>
+            <w:r>
+              <w:rPr>
+                <w:rFonts w:ascii="Times New Roman" w:cs="Times New Roman" w:eastAsia="Times New Roman" w:hAnsi="Times New Roman"/>
+                <w:sz w:val="21"/>
+                <w:szCs w:val="21"/>
+                <w:rtl w:val="0"/>
+              </w:rPr>
+              <w:t xml:space="preserve">Then the board remains unchanged and an invalid-move message appears.</w:t>
+            </w:r>
+          </w:p>
+        </w:tc>
+        <w:tc>
+          <w:tcPr/>
+          <w:p>
+            <w:pPr>
+              <w:rPr>
+                <w:rFonts w:ascii="Times New Roman" w:cs="Times New Roman" w:eastAsia="Times New Roman" w:hAnsi="Times New Roman"/>
+                <w:sz w:val="21"/>
+                <w:szCs w:val="21"/>
+              </w:rPr>
+            </w:pPr>
+            <w:r>
+              <w:rPr>
+                <w:rFonts w:ascii="Times New Roman" w:cs="Times New Roman" w:eastAsia="Times New Roman" w:hAnsi="Times New Roman"/>
+                <w:sz w:val="21"/>
+                <w:szCs w:val="21"/>
+                <w:rtl w:val="0"/>
+              </w:rPr>
+              <w:t xml:space="preserve">ToDo</w:t>
+            </w:r>
+          </w:p>
+        </w:tc>
+      </w:tr>
+      <w:tr>
+        <w:trPr>
+          <w:cantSplit w:val="0"/>
+          <w:tblHeader w:val="0"/>
+        </w:trPr>
+        <w:tc>
+          <w:tcPr/>
+          <w:p>
+            <w:pPr>
+              <w:rPr>
+                <w:rFonts w:ascii="Times New Roman" w:cs="Times New Roman" w:eastAsia="Times New Roman" w:hAnsi="Times New Roman"/>
+                <w:sz w:val="21"/>
+                <w:szCs w:val="21"/>
+              </w:rPr>
+            </w:pPr>
+            <w:r>
+              <w:rPr>
+                <w:rFonts w:ascii="Times New Roman" w:cs="Times New Roman" w:eastAsia="Times New Roman" w:hAnsi="Times New Roman"/>
+                <w:sz w:val="21"/>
+                <w:szCs w:val="21"/>
+                <w:rtl w:val="0"/>
+              </w:rPr>
+              <w:t xml:space="preserve">5. A game is over</w:t>
+            </w:r>
+          </w:p>
+        </w:tc>
+        <w:tc>
+          <w:tcPr/>
+          <w:p>
+            <w:pPr>
+              <w:rPr>
+                <w:rFonts w:ascii="Times New Roman" w:cs="Times New Roman" w:eastAsia="Times New Roman" w:hAnsi="Times New Roman"/>
+                <w:sz w:val="21"/>
+                <w:szCs w:val="21"/>
+              </w:rPr>
+            </w:pPr>
+            <w:r>
+              <w:rPr>
+                <w:rtl w:val="0"/>
+              </w:rPr>
+            </w:r>
+          </w:p>
+        </w:tc>
+        <w:tc>
+          <w:tcPr/>
+          <w:p>
+            <w:pPr>
+              <w:rPr>
+                <w:rFonts w:ascii="Times New Roman" w:cs="Times New Roman" w:eastAsia="Times New Roman" w:hAnsi="Times New Roman"/>
+                <w:sz w:val="21"/>
+                <w:szCs w:val="21"/>
+              </w:rPr>
+            </w:pPr>
+            <w:r>
+              <w:rPr>
+                <w:rFonts w:ascii="Times New Roman" w:cs="Times New Roman" w:eastAsia="Times New Roman" w:hAnsi="Times New Roman"/>
+                <w:sz w:val="21"/>
+                <w:szCs w:val="21"/>
+                <w:rtl w:val="0"/>
+              </w:rPr>
+              <w:t xml:space="preserve">Given no valid moves remain</w:t>
+            </w:r>
+          </w:p>
+          <w:p>
+            <w:pPr>
+              <w:rPr>
+                <w:rFonts w:ascii="Times New Roman" w:cs="Times New Roman" w:eastAsia="Times New Roman" w:hAnsi="Times New Roman"/>
+                <w:sz w:val="21"/>
+                <w:szCs w:val="21"/>
+              </w:rPr>
+            </w:pPr>
+            <w:r>
+              <w:rPr>
+                <w:rFonts w:ascii="Times New Roman" w:cs="Times New Roman" w:eastAsia="Times New Roman" w:hAnsi="Times New Roman"/>
+                <w:sz w:val="21"/>
+                <w:szCs w:val="21"/>
+                <w:rtl w:val="0"/>
+              </w:rPr>
+              <w:t xml:space="preserve">When the game checks the board</w:t>
+            </w:r>
+          </w:p>
+          <w:p>
+            <w:pPr>
+              <w:rPr>
+                <w:rFonts w:ascii="Times New Roman" w:cs="Times New Roman" w:eastAsia="Times New Roman" w:hAnsi="Times New Roman"/>
+                <w:sz w:val="21"/>
+                <w:szCs w:val="21"/>
+              </w:rPr>
+            </w:pPr>
+            <w:r>
+              <w:rPr>
+                <w:rFonts w:ascii="Times New Roman" w:cs="Times New Roman" w:eastAsia="Times New Roman" w:hAnsi="Times New Roman"/>
+                <w:sz w:val="21"/>
+                <w:szCs w:val="21"/>
+                <w:rtl w:val="0"/>
+              </w:rPr>
+              <w:t xml:space="preserve">Then it displays game over and the remaining peg count, showing a win if exactly one peg remains and a loss otherwise.</w:t>
+            </w:r>
+          </w:p>
+        </w:tc>
+        <w:tc>
+          <w:tcPr/>
+          <w:p>
+            <w:pPr>
+              <w:rPr>
+                <w:rFonts w:ascii="Times New Roman" w:cs="Times New Roman" w:eastAsia="Times New Roman" w:hAnsi="Times New Roman"/>
+                <w:sz w:val="21"/>
+                <w:szCs w:val="21"/>
+              </w:rPr>
+            </w:pPr>
+            <w:r>
+              <w:rPr>
+                <w:rFonts w:ascii="Times New Roman" w:cs="Times New Roman" w:eastAsia="Times New Roman" w:hAnsi="Times New Roman"/>
+                <w:sz w:val="21"/>
+                <w:szCs w:val="21"/>
+                <w:rtl w:val="0"/>
+              </w:rPr>
+              <w:t xml:space="preserve">ToDo</w:t>
             </w:r>
           </w:p>
         </w:tc>

</xml_diff>